<commit_message>
Fix Versorgungsausgleich testakte calculations
</commit_message>
<xml_diff>
--- a/testakten/versausgleich-haerte-bgh-schaefer-nuernberg/docx/AG_Nuernberg_Fuerth_Beschluss_28_02_2022.docx
+++ b/testakten/versausgleich-haerte-bgh-schaefer-nuernberg/docx/AG_Nuernberg_Fuerth_Beschluss_28_02_2022.docx
@@ -147,22 +147,22 @@
     </w:p>
     <w:p>
       <w:r>
-        <w:t xml:space="preserve">  a) im Wege der internen Teilung nach § 10 VersAusglG zu Lasten des Anrechts des Antragstellers bei der Bayerischen Versorgungskammer - Bayerische Aerzteversorgung - (Mitglieds-Nr. 14-072 184/1958) zugunsten der Antragsgegnerin ein Anrecht in Hoehe von monatlich 2.063,71 EUR, bezogen auf den 30.04.2021 als Ende der Ehezeit; Teilungskosten 500 EUR sind beruecksichtigt;</w:t>
+        <w:t>2.1 Im Wege der internen Teilung nach § 10 VersAusglG wird zu Lasten des Anrechts des Antragstellers bei der Bayerischen Versorgungskammer - Bayerische Aerzteversorgung - (Mitglieds-Nr. 14-072 184/1958) zugunsten der Antragsgegnerin ein Anrecht in Hoehe von monatlich 2.063,71 EUR, bezogen auf den 30.04.2021 als Ende der Ehezeit, uebertragen; Teilungskosten 500 EUR sind beruecksichtigt.</w:t>
       </w:r>
     </w:p>
     <w:p>
       <w:r>
-        <w:t xml:space="preserve">  b) im Wege der internen Teilung nach § 10 VersAusglG zu Lasten des Anrechts des Antragstellers bei der Deutschen Rentenversicherung Nordbayern (Versicherungs-Nr. 65 030258 S 010) zugunsten der Antragsgegnerin ein Anrecht in Hoehe von 1,0917 Entgeltpunkten, bezogen auf den 30.04.2021;</w:t>
+        <w:t>2.2 Im Wege der internen Teilung nach § 10 VersAusglG wird zu Lasten des Anrechts des Antragstellers bei der Deutschen Rentenversicherung Nordbayern (Versicherungs-Nr. 65 030258 S 010) zugunsten der Antragsgegnerin ein Anrecht in Hoehe von 1,0917 Entgeltpunkten, bezogen auf den 30.04.2021, uebertragen.</w:t>
       </w:r>
     </w:p>
     <w:p>
       <w:r>
-        <w:t xml:space="preserve">  c) im Wege der externen Teilung nach § 14 VersAusglG zu Lasten des Anrechts des Antragstellers bei der Allianz Lebensversicherungs-AG (Vertrags-Nr. 0817 4118 22) ein Kapitalbetrag in Hoehe von 8.736,71 EUR zugunsten einer von der Antragsgegnerin innerhalb von zwei Monaten ab Rechtskraft zu benennenden Zielversorgung;</w:t>
+        <w:t>2.3 Im Wege der externen Teilung nach § 14 VersAusglG wird zu Lasten des Anrechts des Antragstellers bei der Allianz Lebensversicherungs-AG (Vertrags-Nr. 0817 4118 22) ein Kapitalbetrag in Hoehe von 8.736,71 EUR zugunsten einer von der Antragsgegnerin innerhalb von zwei Monaten ab Rechtskraft zu benennenden Zielversorgung uebertragen.</w:t>
       </w:r>
     </w:p>
     <w:p>
       <w:r>
-        <w:t xml:space="preserve">  d) im Wege der externen Teilung nach § 14 VersAusglG zu Lasten des Anrechts des Antragstellers bei der Wuerttembergischen Lebensversicherung AG (Vertrags-Nr. 4471 9982 73) ein Kapitalbetrag in Hoehe von 22.165,89 EUR zugunsten einer von der Antragsgegnerin innerhalb von zwei Monaten ab Rechtskraft zu benennenden Zielversorgung.</w:t>
+        <w:t>2.4 Im Wege der externen Teilung nach § 14 VersAusglG wird zu Lasten des Anrechts des Antragstellers bei der Wuerttembergischen Lebensversicherung AG (Vertrags-Nr. 4471 9982 73) ein Kapitalbetrag in Hoehe von 22.165,89 EUR zugunsten einer von der Antragsgegnerin innerhalb von zwei Monaten ab Rechtskraft zu benennenden Zielversorgung uebertragen.</w:t>
       </w:r>
     </w:p>
     <w:p>
@@ -170,7 +170,12 @@
     </w:p>
     <w:p>
       <w:r>
-        <w:t>3. Im Wege der internen Teilung wird zu Lasten des Anrechts der Antragsgegnerin bei dem Freistaat Bayern (Bayerisches Landesamt fuer Finanzen) zugunsten des Antragstellers ein Anrecht in Hoehe von monatlich 925,00 EUR uebertragen, bezogen auf den 30.04.2021. Im Wege der internen Teilung wird zu Lasten des Anrechts der Antragsgegnerin bei der Deutschen Rentenversicherung Bund zugunsten des Antragstellers ein Anrecht in Hoehe von 6,25 Entgeltpunkten uebertragen, bezogen auf den 30.04.2021.</w:t>
+        <w:t>3.1 Im Wege der internen Teilung wird zu Lasten des Anrechts der Antragsgegnerin bei dem Freistaat Bayern (Bayerisches Landesamt fuer Finanzen) zugunsten des Antragstellers ein Anrecht in Hoehe von monatlich 925,00 EUR uebertragen, bezogen auf den 30.04.2021.</w:t>
+      </w:r>
+    </w:p>
+    <w:p>
+      <w:r>
+        <w:t>3.2 Im Wege der internen Teilung wird zu Lasten des ehezeitlichen Anrechts der Antragsgegnerin bei der Deutschen Rentenversicherung Bund zugunsten des Antragstellers ein Anrecht in Hoehe von 2,6000 Entgeltpunkten uebertragen, bezogen auf den 30.04.2021.</w:t>
       </w:r>
     </w:p>
     <w:p>
@@ -205,7 +210,7 @@
     </w:p>
     <w:p>
       <w:r>
-        <w:t>I.</w:t>
+        <w:t>1. Ehe, Trennung und Scheidungsvoraussetzungen</w:t>
       </w:r>
     </w:p>
     <w:p>
@@ -228,12 +233,12 @@
     </w:p>
     <w:p>
       <w:r>
-        <w:t>II.</w:t>
+        <w:t>2. Versorgungsausgleich und Ehezeit</w:t>
       </w:r>
     </w:p>
     <w:p>
       <w:r>
-        <w:t>Der Versorgungsausgleich ist nach § 1587 BGB i. V. m. den Bestimmungen des VersAusglG von Amts wegen durchzufuehren. Die Ehezeit nach § 3 Abs. 1 VersAusglG dauerte vom 01.09.1987 bis 30.04.2021.</w:t>
+        <w:t>Der Versorgungsausgleich ist nach §§ 1, 3 VersAusglG von Amts wegen durchzufuehren. Die Ehezeit nach § 3 Abs. 1 VersAusglG dauerte vom 01.09.1987 bis 30.04.2021.</w:t>
       </w:r>
     </w:p>
     <w:p>
@@ -284,7 +289,7 @@
     </w:p>
     <w:p>
       <w:r>
-        <w:t>- DRV Bund: 12,5 EP (Ausgleichswert 6,25 EP).</w:t>
+        <w:t>- DRV Bund: 5,2 ehezeitliche Entgeltpunkte bei 12,5 Entgeltpunkten Gesamtkonto (Ausgleichswert 2,6 EP).</w:t>
       </w:r>
     </w:p>
     <w:p>
@@ -292,7 +297,7 @@
     </w:p>
     <w:p>
       <w:r>
-        <w:t>III.</w:t>
+        <w:t>3. Antrag auf Ausschluss oder Reduzierung</w:t>
       </w:r>
     </w:p>
     <w:p>
@@ -313,7 +318,7 @@
     </w:p>
     <w:p>
       <w:r>
-        <w:t>IV.</w:t>
+        <w:t>4. Keine grobe Unbilligkeit</w:t>
       </w:r>
     </w:p>
     <w:p>

</xml_diff>